<commit_message>
Update Jamf Pro URL Change Plan with additional safeguards
- Add Extension Attributes to Phase 0.3 config documentation checklist
- Add Phase 0.8: proactive Tomcat keystore backup before maintenance window
- Add Phase 0.9: Jamf Connect / NoMAD check and config profile update steps
- Add warning to profiles -D last-resort step re: removal of non-Jamf profiles
- Add Self Service URL caching note to Phase 3 verification checklist

Co-Authored-By: Claude Sonnet 4.6 <noreply@anthropic.com>
</commit_message>
<xml_diff>
--- a/Jamf_Pro_URL_Change_Plan.docx
+++ b/Jamf_Pro_URL_Change_Plan.docx
@@ -568,6 +568,14 @@
     <w:p>
       <w:pPr>
         <w:pStyle w:val="MyBody"/>
+      </w:pPr>
+      <w:r>
+        <w:t xml:space="preserve">☐  Settings → Computer Management → Extension Attributes  (search for old URL in attribute scripts)</w:t>
+      </w:r>
+    </w:p>
+    <w:p>
+      <w:pPr>
+        <w:pStyle w:val="MyBody"/>
         <w:ind w:left="360"/>
       </w:pPr>
       <w:r>
@@ -804,6 +812,94 @@
       </w:r>
       <w:r>
         <w:t>Count of devices not checked in recently: ________________________________</w:t>
+      </w:r>
+    </w:p>
+    <w:p>
+      <w:pPr>
+        <w:pStyle w:val="MyH3"/>
+      </w:pPr>
+      <w:r>
+        <w:t xml:space="preserve">0.8  Tomcat Keystore Backup</w:t>
+      </w:r>
+    </w:p>
+    <w:p>
+      <w:pPr>
+        <w:pStyle w:val="MyBody"/>
+      </w:pPr>
+      <w:r>
+        <w:t xml:space="preserve">☐  Back up the current Tomcat keystore BEFORE the maintenance window:</w:t>
+      </w:r>
+    </w:p>
+    <w:p>
+      <w:pPr>
+        <w:pStyle w:val="MyBody"/>
+      </w:pPr>
+      <w:r>
+        <w:t xml:space="preserve">     sudo cp /usr/local/jss/tomcat/keystore ~/keystore.backup.$(date +%Y%m%d)</w:t>
+      </w:r>
+    </w:p>
+    <w:p>
+      <w:pPr>
+        <w:pStyle w:val="MyBody"/>
+      </w:pPr>
+      <w:r>
+        <w:t xml:space="preserve">☐  Store the backup in a secure location separate from the Jamf server.</w:t>
+      </w:r>
+    </w:p>
+    <w:p>
+      <w:pPr>
+        <w:pStyle w:val="MyBody"/>
+      </w:pPr>
+      <w:r>
+        <w:t xml:space="preserve">☐  Keystore backup path confirmed: ________________________________</w:t>
+      </w:r>
+    </w:p>
+    <w:p>
+      <w:pPr>
+        <w:pStyle w:val="MyH3"/>
+      </w:pPr>
+      <w:r>
+        <w:t xml:space="preserve">0.9  Jamf Connect / NoMAD Check (If Applicable)</w:t>
+      </w:r>
+    </w:p>
+    <w:p>
+      <w:pPr>
+        <w:pStyle w:val="MyBody"/>
+      </w:pPr>
+      <w:r>
+        <w:t xml:space="preserve">If Jamf Connect or NoMAD is deployed, its configuration profile contains the Jamf Pro URL. Re-enrollment alone will NOT update it — a separate config profile push is required.</w:t>
+      </w:r>
+    </w:p>
+    <w:p>
+      <w:pPr>
+        <w:pStyle w:val="MyBody"/>
+      </w:pPr>
+      <w:r>
+        <w:t xml:space="preserve">☐  Confirm whether Jamf Connect or NoMAD is deployed on managed devices.</w:t>
+      </w:r>
+    </w:p>
+    <w:p>
+      <w:pPr>
+        <w:pStyle w:val="MyBody"/>
+      </w:pPr>
+      <w:r>
+        <w:t xml:space="preserve">☐  If yes: prepare an updated Jamf Connect / NoMAD configuration profile with the new URL before the maintenance window.</w:t>
+      </w:r>
+    </w:p>
+    <w:p>
+      <w:pPr>
+        <w:pStyle w:val="MyBody"/>
+      </w:pPr>
+      <w:r>
+        <w:t xml:space="preserve">☐  After re-enrollment completes: push the updated config profile to all devices.</w:t>
+      </w:r>
+    </w:p>
+    <w:p>
+      <w:pPr>
+        <w:pStyle w:val="MyBody"/>
+      </w:pPr>
+      <w:r>
+        <w:t xml:space="preserve">☐  Verify Jamf Connect / NoMAD authentication works correctly at the new URL on a test device before mass deployment.</w:t>
       </w:r>
     </w:p>
     <w:p>
@@ -1250,6 +1346,14 @@
     </w:p>
     <w:p>
       <w:pPr>
+        <w:pStyle w:val="MyBody"/>
+      </w:pPr>
+      <w:r>
+        <w:t xml:space="preserve">     ⚠ Warning: sudo profiles -D removes ALL profiles on the device, including non-Jamf profiles (FileVault, STIG configuration profiles, etc.). Use ONLY as a last resort and contact IT before proceeding. Re-enrollment will restore Jamf-managed profiles; other profiles may need to be re-pushed manually.</w:t>
+      </w:r>
+    </w:p>
+    <w:p>
+      <w:pPr>
         <w:pStyle w:val="MyH3"/>
       </w:pPr>
       <w:r>
@@ -1405,6 +1509,14 @@
       </w:r>
       <w:r>
         <w:t>Self Service app opens and loads policies (if applicable)</w:t>
+      </w:r>
+    </w:p>
+    <w:p>
+      <w:pPr>
+        <w:pStyle w:val="MyBody"/>
+      </w:pPr>
+      <w:r>
+        <w:t xml:space="preserve">     Note: Self Service caches the Jamf Pro URL. If it fails to load after re-enrollment, quit and relaunch Self Service. If it still fails, remove and reinstall the Self Service app.</w:t>
       </w:r>
     </w:p>
     <w:p>

</xml_diff>